<commit_message>
Add roaster directory files, GSC growth plan, and update about page
- New roaster data files: CoffeeRoastersList.csv, roasters_clean.csv, roasters_enrichment_progress.jsonl, roasters_issues.md
- ROASTER-DIRECTORY-BUILD-PLAN.md and The-Beans-Hub-GSC-Growth-Plan.docx
- Updated about/index.html
- Updated TikTok/Instagram series doc

Co-Authored-By: Claude Sonnet 4.6 <noreply@anthropic.com>
</commit_message>
<xml_diff>
--- a/For a series on TikTok and Instagram.docx
+++ b/For a series on TikTok and Instagram.docx
@@ -250,7 +250,29 @@
           <w:szCs w:val="22"/>
           <w14:ligatures w14:val="none"/>
         </w:rPr>
-        <w:t>This is my day 1 of building The Beans Hub publicly.</w:t>
+        <w:t xml:space="preserve">This is my day </w:t>
+      </w:r>
+      <w:r>
+        <w:rPr>
+          <w:rFonts w:ascii="Arial" w:eastAsia="Times New Roman" w:hAnsi="Arial" w:cs="Arial"/>
+          <w:color w:val="000000"/>
+          <w:kern w:val="0"/>
+          <w:sz w:val="22"/>
+          <w:szCs w:val="22"/>
+          <w14:ligatures w14:val="none"/>
+        </w:rPr>
+        <w:t>2</w:t>
+      </w:r>
+      <w:r>
+        <w:rPr>
+          <w:rFonts w:ascii="Arial" w:eastAsia="Times New Roman" w:hAnsi="Arial" w:cs="Arial"/>
+          <w:color w:val="000000"/>
+          <w:kern w:val="0"/>
+          <w:sz w:val="22"/>
+          <w:szCs w:val="22"/>
+          <w14:ligatures w14:val="none"/>
+        </w:rPr>
+        <w:t xml:space="preserve"> of building The Beans Hub publicly.</w:t>
       </w:r>
     </w:p>
     <w:p>
@@ -281,15 +303,40 @@
           <w:szCs w:val="22"/>
           <w14:ligatures w14:val="none"/>
         </w:rPr>
-        <w:t>During the pandemic, I told my friends to buy me a coffee machine as birthday present.</w:t>
+        <w:t>I’m not sure if this video will reach to those who drinks latte or pour over, but</w:t>
+      </w:r>
+      <w:r>
+        <w:rPr>
+          <w:rFonts w:ascii="Arial" w:eastAsia="Times New Roman" w:hAnsi="Arial" w:cs="Arial"/>
+          <w:color w:val="000000"/>
+          <w:kern w:val="0"/>
+          <w:sz w:val="22"/>
+          <w:szCs w:val="22"/>
+          <w14:ligatures w14:val="none"/>
+        </w:rPr>
+        <w:t xml:space="preserve"> whoever it is,</w:t>
+      </w:r>
+      <w:r>
+        <w:rPr>
+          <w:rFonts w:ascii="Arial" w:eastAsia="Times New Roman" w:hAnsi="Arial" w:cs="Arial"/>
+          <w:color w:val="000000"/>
+          <w:kern w:val="0"/>
+          <w:sz w:val="22"/>
+          <w:szCs w:val="22"/>
+          <w14:ligatures w14:val="none"/>
+        </w:rPr>
+        <w:t xml:space="preserve"> I personally think that this website is amazing for people who buys coffee beans.</w:t>
       </w:r>
     </w:p>
     <w:p>
       <w:pPr>
         <w:spacing w:after="0" w:line="240" w:lineRule="auto"/>
         <w:rPr>
-          <w:rFonts w:ascii="Times New Roman" w:eastAsia="Times New Roman" w:hAnsi="Times New Roman" w:cs="Times New Roman"/>
-          <w:kern w:val="0"/>
+          <w:rFonts w:ascii="Arial" w:eastAsia="Times New Roman" w:hAnsi="Arial" w:cs="Arial"/>
+          <w:color w:val="000000"/>
+          <w:kern w:val="0"/>
+          <w:sz w:val="22"/>
+          <w:szCs w:val="22"/>
           <w14:ligatures w14:val="none"/>
         </w:rPr>
       </w:pPr>
@@ -302,7 +349,278 @@
           <w:szCs w:val="22"/>
           <w14:ligatures w14:val="none"/>
         </w:rPr>
-        <w:t>I’m not sure if this video will reach to those who drinks latte or pour over, but I personally think that this website is amazing for people who buys coffee beans.</w:t>
+        <w:t xml:space="preserve">You know all this time, whenever my coffee beans finish, </w:t>
+      </w:r>
+      <w:proofErr w:type="spellStart"/>
+      <w:r>
+        <w:rPr>
+          <w:rFonts w:ascii="Arial" w:eastAsia="Times New Roman" w:hAnsi="Arial" w:cs="Arial"/>
+          <w:color w:val="000000"/>
+          <w:kern w:val="0"/>
+          <w:sz w:val="22"/>
+          <w:szCs w:val="22"/>
+          <w14:ligatures w14:val="none"/>
+        </w:rPr>
+        <w:t>i</w:t>
+      </w:r>
+      <w:proofErr w:type="spellEnd"/>
+      <w:r>
+        <w:rPr>
+          <w:rFonts w:ascii="Arial" w:eastAsia="Times New Roman" w:hAnsi="Arial" w:cs="Arial"/>
+          <w:color w:val="000000"/>
+          <w:kern w:val="0"/>
+          <w:sz w:val="22"/>
+          <w:szCs w:val="22"/>
+          <w14:ligatures w14:val="none"/>
+        </w:rPr>
+        <w:t xml:space="preserve"> </w:t>
+      </w:r>
+      <w:proofErr w:type="spellStart"/>
+      <w:r>
+        <w:rPr>
+          <w:rFonts w:ascii="Arial" w:eastAsia="Times New Roman" w:hAnsi="Arial" w:cs="Arial"/>
+          <w:color w:val="000000"/>
+          <w:kern w:val="0"/>
+          <w:sz w:val="22"/>
+          <w:szCs w:val="22"/>
+          <w14:ligatures w14:val="none"/>
+        </w:rPr>
+        <w:t>wanna</w:t>
+      </w:r>
+      <w:proofErr w:type="spellEnd"/>
+      <w:r>
+        <w:rPr>
+          <w:rFonts w:ascii="Arial" w:eastAsia="Times New Roman" w:hAnsi="Arial" w:cs="Arial"/>
+          <w:color w:val="000000"/>
+          <w:kern w:val="0"/>
+          <w:sz w:val="22"/>
+          <w:szCs w:val="22"/>
+          <w14:ligatures w14:val="none"/>
+        </w:rPr>
+        <w:t xml:space="preserve"> buy something new. </w:t>
+      </w:r>
+      <w:r>
+        <w:rPr>
+          <w:rFonts w:ascii="Arial" w:eastAsia="Times New Roman" w:hAnsi="Arial" w:cs="Arial"/>
+          <w:color w:val="000000"/>
+          <w:kern w:val="0"/>
+          <w:sz w:val="22"/>
+          <w:szCs w:val="22"/>
+          <w14:ligatures w14:val="none"/>
+        </w:rPr>
+        <w:br/>
+        <w:t>The problem is, if</w:t>
+      </w:r>
+      <w:r>
+        <w:rPr>
+          <w:rFonts w:ascii="Arial" w:eastAsia="Times New Roman" w:hAnsi="Arial" w:cs="Arial"/>
+          <w:color w:val="000000"/>
+          <w:kern w:val="0"/>
+          <w:sz w:val="22"/>
+          <w:szCs w:val="22"/>
+          <w14:ligatures w14:val="none"/>
+        </w:rPr>
+        <w:t xml:space="preserve"> </w:t>
+      </w:r>
+      <w:r>
+        <w:rPr>
+          <w:rFonts w:ascii="Arial" w:eastAsia="Times New Roman" w:hAnsi="Arial" w:cs="Arial"/>
+          <w:color w:val="000000"/>
+          <w:kern w:val="0"/>
+          <w:sz w:val="22"/>
+          <w:szCs w:val="22"/>
+          <w14:ligatures w14:val="none"/>
+        </w:rPr>
+        <w:t>I</w:t>
+      </w:r>
+      <w:r>
+        <w:rPr>
+          <w:rFonts w:ascii="Arial" w:eastAsia="Times New Roman" w:hAnsi="Arial" w:cs="Arial"/>
+          <w:color w:val="000000"/>
+          <w:kern w:val="0"/>
+          <w:sz w:val="22"/>
+          <w:szCs w:val="22"/>
+          <w14:ligatures w14:val="none"/>
+        </w:rPr>
+        <w:t xml:space="preserve"> have had a good cup from cafe visits, then yeah, </w:t>
+      </w:r>
+      <w:r>
+        <w:rPr>
+          <w:rFonts w:ascii="Arial" w:eastAsia="Times New Roman" w:hAnsi="Arial" w:cs="Arial"/>
+          <w:color w:val="000000"/>
+          <w:kern w:val="0"/>
+          <w:sz w:val="22"/>
+          <w:szCs w:val="22"/>
+          <w14:ligatures w14:val="none"/>
+        </w:rPr>
+        <w:t>I</w:t>
+      </w:r>
+      <w:r>
+        <w:rPr>
+          <w:rFonts w:ascii="Arial" w:eastAsia="Times New Roman" w:hAnsi="Arial" w:cs="Arial"/>
+          <w:color w:val="000000"/>
+          <w:kern w:val="0"/>
+          <w:sz w:val="22"/>
+          <w:szCs w:val="22"/>
+          <w14:ligatures w14:val="none"/>
+        </w:rPr>
+        <w:t xml:space="preserve"> know what</w:t>
+      </w:r>
+      <w:r>
+        <w:rPr>
+          <w:rFonts w:ascii="Arial" w:eastAsia="Times New Roman" w:hAnsi="Arial" w:cs="Arial"/>
+          <w:color w:val="000000"/>
+          <w:kern w:val="0"/>
+          <w:sz w:val="22"/>
+          <w:szCs w:val="22"/>
+          <w14:ligatures w14:val="none"/>
+        </w:rPr>
+        <w:t>’s</w:t>
+      </w:r>
+      <w:r>
+        <w:rPr>
+          <w:rFonts w:ascii="Arial" w:eastAsia="Times New Roman" w:hAnsi="Arial" w:cs="Arial"/>
+          <w:color w:val="000000"/>
+          <w:kern w:val="0"/>
+          <w:sz w:val="22"/>
+          <w:szCs w:val="22"/>
+          <w14:ligatures w14:val="none"/>
+        </w:rPr>
+        <w:t xml:space="preserve"> next. </w:t>
+      </w:r>
+      <w:r>
+        <w:rPr>
+          <w:rFonts w:ascii="Arial" w:eastAsia="Times New Roman" w:hAnsi="Arial" w:cs="Arial"/>
+          <w:color w:val="000000"/>
+          <w:kern w:val="0"/>
+          <w:sz w:val="22"/>
+          <w:szCs w:val="22"/>
+          <w14:ligatures w14:val="none"/>
+        </w:rPr>
+        <w:br/>
+      </w:r>
+      <w:r>
+        <w:rPr>
+          <w:rFonts w:ascii="Arial" w:eastAsia="Times New Roman" w:hAnsi="Arial" w:cs="Arial"/>
+          <w:color w:val="000000"/>
+          <w:kern w:val="0"/>
+          <w:sz w:val="22"/>
+          <w:szCs w:val="22"/>
+          <w14:ligatures w14:val="none"/>
+        </w:rPr>
+        <w:t xml:space="preserve">But, if </w:t>
+      </w:r>
+      <w:proofErr w:type="spellStart"/>
+      <w:r>
+        <w:rPr>
+          <w:rFonts w:ascii="Arial" w:eastAsia="Times New Roman" w:hAnsi="Arial" w:cs="Arial"/>
+          <w:color w:val="000000"/>
+          <w:kern w:val="0"/>
+          <w:sz w:val="22"/>
+          <w:szCs w:val="22"/>
+          <w14:ligatures w14:val="none"/>
+        </w:rPr>
+        <w:t>i</w:t>
+      </w:r>
+      <w:proofErr w:type="spellEnd"/>
+      <w:r>
+        <w:rPr>
+          <w:rFonts w:ascii="Arial" w:eastAsia="Times New Roman" w:hAnsi="Arial" w:cs="Arial"/>
+          <w:color w:val="000000"/>
+          <w:kern w:val="0"/>
+          <w:sz w:val="22"/>
+          <w:szCs w:val="22"/>
+          <w14:ligatures w14:val="none"/>
+        </w:rPr>
+        <w:t xml:space="preserve"> </w:t>
+      </w:r>
+      <w:r>
+        <w:rPr>
+          <w:rFonts w:ascii="Arial" w:eastAsia="Times New Roman" w:hAnsi="Arial" w:cs="Arial"/>
+          <w:color w:val="000000"/>
+          <w:kern w:val="0"/>
+          <w:sz w:val="22"/>
+          <w:szCs w:val="22"/>
+          <w14:ligatures w14:val="none"/>
+        </w:rPr>
+        <w:t>haven’t</w:t>
+      </w:r>
+      <w:r>
+        <w:rPr>
+          <w:rFonts w:ascii="Arial" w:eastAsia="Times New Roman" w:hAnsi="Arial" w:cs="Arial"/>
+          <w:color w:val="000000"/>
+          <w:kern w:val="0"/>
+          <w:sz w:val="22"/>
+          <w:szCs w:val="22"/>
+          <w14:ligatures w14:val="none"/>
+        </w:rPr>
+        <w:t xml:space="preserve"> found one, or maybe </w:t>
+      </w:r>
+      <w:r>
+        <w:rPr>
+          <w:rFonts w:ascii="Arial" w:eastAsia="Times New Roman" w:hAnsi="Arial" w:cs="Arial"/>
+          <w:color w:val="000000"/>
+          <w:kern w:val="0"/>
+          <w:sz w:val="22"/>
+          <w:szCs w:val="22"/>
+          <w14:ligatures w14:val="none"/>
+        </w:rPr>
+        <w:t>I</w:t>
+      </w:r>
+      <w:r>
+        <w:rPr>
+          <w:rFonts w:ascii="Arial" w:eastAsia="Times New Roman" w:hAnsi="Arial" w:cs="Arial"/>
+          <w:color w:val="000000"/>
+          <w:kern w:val="0"/>
+          <w:sz w:val="22"/>
+          <w:szCs w:val="22"/>
+          <w14:ligatures w14:val="none"/>
+        </w:rPr>
+        <w:t xml:space="preserve"> </w:t>
+      </w:r>
+      <w:r>
+        <w:rPr>
+          <w:rFonts w:ascii="Arial" w:eastAsia="Times New Roman" w:hAnsi="Arial" w:cs="Arial"/>
+          <w:color w:val="000000"/>
+          <w:kern w:val="0"/>
+          <w:sz w:val="22"/>
+          <w:szCs w:val="22"/>
+          <w14:ligatures w14:val="none"/>
+        </w:rPr>
+        <w:t>haven’t</w:t>
+      </w:r>
+      <w:r>
+        <w:rPr>
+          <w:rFonts w:ascii="Arial" w:eastAsia="Times New Roman" w:hAnsi="Arial" w:cs="Arial"/>
+          <w:color w:val="000000"/>
+          <w:kern w:val="0"/>
+          <w:sz w:val="22"/>
+          <w:szCs w:val="22"/>
+          <w14:ligatures w14:val="none"/>
+        </w:rPr>
+        <w:t xml:space="preserve"> had any recent trips to those cafe who roast their own beans, then </w:t>
+      </w:r>
+      <w:r>
+        <w:rPr>
+          <w:rFonts w:ascii="Arial" w:eastAsia="Times New Roman" w:hAnsi="Arial" w:cs="Arial"/>
+          <w:color w:val="000000"/>
+          <w:kern w:val="0"/>
+          <w:sz w:val="22"/>
+          <w:szCs w:val="22"/>
+          <w14:ligatures w14:val="none"/>
+        </w:rPr>
+        <w:t>I’d</w:t>
+      </w:r>
+      <w:r>
+        <w:rPr>
+          <w:rFonts w:ascii="Arial" w:eastAsia="Times New Roman" w:hAnsi="Arial" w:cs="Arial"/>
+          <w:color w:val="000000"/>
+          <w:kern w:val="0"/>
+          <w:sz w:val="22"/>
+          <w:szCs w:val="22"/>
+          <w14:ligatures w14:val="none"/>
+        </w:rPr>
+        <w:t xml:space="preserve"> either have to go to Shopee, or those individual website right. Shopee has everything you want or need, but it can get a little bit difficult when you want to narrow down on the coffee profiles.</w:t>
       </w:r>
     </w:p>
     <w:p>
@@ -323,237 +641,52 @@
           <w:szCs w:val="22"/>
           <w14:ligatures w14:val="none"/>
         </w:rPr>
-        <w:t xml:space="preserve">You know all this time, whenever my coffee beans finish, </w:t>
-      </w:r>
-      <w:proofErr w:type="spellStart"/>
-      <w:r>
-        <w:rPr>
-          <w:rFonts w:ascii="Arial" w:eastAsia="Times New Roman" w:hAnsi="Arial" w:cs="Arial"/>
-          <w:color w:val="000000"/>
-          <w:kern w:val="0"/>
-          <w:sz w:val="22"/>
-          <w:szCs w:val="22"/>
-          <w14:ligatures w14:val="none"/>
-        </w:rPr>
-        <w:t>i</w:t>
-      </w:r>
-      <w:proofErr w:type="spellEnd"/>
-      <w:r>
-        <w:rPr>
-          <w:rFonts w:ascii="Arial" w:eastAsia="Times New Roman" w:hAnsi="Arial" w:cs="Arial"/>
-          <w:color w:val="000000"/>
-          <w:kern w:val="0"/>
-          <w:sz w:val="22"/>
-          <w:szCs w:val="22"/>
-          <w14:ligatures w14:val="none"/>
-        </w:rPr>
-        <w:t xml:space="preserve"> </w:t>
-      </w:r>
-      <w:proofErr w:type="spellStart"/>
-      <w:r>
-        <w:rPr>
-          <w:rFonts w:ascii="Arial" w:eastAsia="Times New Roman" w:hAnsi="Arial" w:cs="Arial"/>
-          <w:color w:val="000000"/>
-          <w:kern w:val="0"/>
-          <w:sz w:val="22"/>
-          <w:szCs w:val="22"/>
-          <w14:ligatures w14:val="none"/>
-        </w:rPr>
-        <w:t>wanna</w:t>
-      </w:r>
-      <w:proofErr w:type="spellEnd"/>
-      <w:r>
-        <w:rPr>
-          <w:rFonts w:ascii="Arial" w:eastAsia="Times New Roman" w:hAnsi="Arial" w:cs="Arial"/>
-          <w:color w:val="000000"/>
-          <w:kern w:val="0"/>
-          <w:sz w:val="22"/>
-          <w:szCs w:val="22"/>
-          <w14:ligatures w14:val="none"/>
-        </w:rPr>
-        <w:t xml:space="preserve"> buy something new. If </w:t>
-      </w:r>
-      <w:proofErr w:type="spellStart"/>
-      <w:r>
-        <w:rPr>
-          <w:rFonts w:ascii="Arial" w:eastAsia="Times New Roman" w:hAnsi="Arial" w:cs="Arial"/>
-          <w:color w:val="000000"/>
-          <w:kern w:val="0"/>
-          <w:sz w:val="22"/>
-          <w:szCs w:val="22"/>
-          <w14:ligatures w14:val="none"/>
-        </w:rPr>
-        <w:t>i</w:t>
-      </w:r>
-      <w:proofErr w:type="spellEnd"/>
-      <w:r>
-        <w:rPr>
-          <w:rFonts w:ascii="Arial" w:eastAsia="Times New Roman" w:hAnsi="Arial" w:cs="Arial"/>
-          <w:color w:val="000000"/>
-          <w:kern w:val="0"/>
-          <w:sz w:val="22"/>
-          <w:szCs w:val="22"/>
-          <w14:ligatures w14:val="none"/>
-        </w:rPr>
-        <w:t xml:space="preserve"> have had a good cup from cafe visits, then yeah, </w:t>
-      </w:r>
-      <w:proofErr w:type="spellStart"/>
-      <w:r>
-        <w:rPr>
-          <w:rFonts w:ascii="Arial" w:eastAsia="Times New Roman" w:hAnsi="Arial" w:cs="Arial"/>
-          <w:color w:val="000000"/>
-          <w:kern w:val="0"/>
-          <w:sz w:val="22"/>
-          <w:szCs w:val="22"/>
-          <w14:ligatures w14:val="none"/>
-        </w:rPr>
-        <w:t>i</w:t>
-      </w:r>
-      <w:proofErr w:type="spellEnd"/>
-      <w:r>
-        <w:rPr>
-          <w:rFonts w:ascii="Arial" w:eastAsia="Times New Roman" w:hAnsi="Arial" w:cs="Arial"/>
-          <w:color w:val="000000"/>
-          <w:kern w:val="0"/>
-          <w:sz w:val="22"/>
-          <w:szCs w:val="22"/>
-          <w14:ligatures w14:val="none"/>
-        </w:rPr>
-        <w:t xml:space="preserve"> know what next. But, if </w:t>
-      </w:r>
-      <w:proofErr w:type="spellStart"/>
-      <w:r>
-        <w:rPr>
-          <w:rFonts w:ascii="Arial" w:eastAsia="Times New Roman" w:hAnsi="Arial" w:cs="Arial"/>
-          <w:color w:val="000000"/>
-          <w:kern w:val="0"/>
-          <w:sz w:val="22"/>
-          <w:szCs w:val="22"/>
-          <w14:ligatures w14:val="none"/>
-        </w:rPr>
-        <w:t>i</w:t>
-      </w:r>
-      <w:proofErr w:type="spellEnd"/>
-      <w:r>
-        <w:rPr>
-          <w:rFonts w:ascii="Arial" w:eastAsia="Times New Roman" w:hAnsi="Arial" w:cs="Arial"/>
-          <w:color w:val="000000"/>
-          <w:kern w:val="0"/>
-          <w:sz w:val="22"/>
-          <w:szCs w:val="22"/>
-          <w14:ligatures w14:val="none"/>
-        </w:rPr>
-        <w:t xml:space="preserve"> </w:t>
-      </w:r>
-      <w:proofErr w:type="spellStart"/>
-      <w:r>
-        <w:rPr>
-          <w:rFonts w:ascii="Arial" w:eastAsia="Times New Roman" w:hAnsi="Arial" w:cs="Arial"/>
-          <w:color w:val="000000"/>
-          <w:kern w:val="0"/>
-          <w:sz w:val="22"/>
-          <w:szCs w:val="22"/>
-          <w14:ligatures w14:val="none"/>
-        </w:rPr>
-        <w:t>havent</w:t>
-      </w:r>
-      <w:proofErr w:type="spellEnd"/>
-      <w:r>
-        <w:rPr>
-          <w:rFonts w:ascii="Arial" w:eastAsia="Times New Roman" w:hAnsi="Arial" w:cs="Arial"/>
-          <w:color w:val="000000"/>
-          <w:kern w:val="0"/>
-          <w:sz w:val="22"/>
-          <w:szCs w:val="22"/>
-          <w14:ligatures w14:val="none"/>
-        </w:rPr>
-        <w:t xml:space="preserve"> found one, or maybe </w:t>
-      </w:r>
-      <w:proofErr w:type="spellStart"/>
-      <w:r>
-        <w:rPr>
-          <w:rFonts w:ascii="Arial" w:eastAsia="Times New Roman" w:hAnsi="Arial" w:cs="Arial"/>
-          <w:color w:val="000000"/>
-          <w:kern w:val="0"/>
-          <w:sz w:val="22"/>
-          <w:szCs w:val="22"/>
-          <w14:ligatures w14:val="none"/>
-        </w:rPr>
-        <w:t>i</w:t>
-      </w:r>
-      <w:proofErr w:type="spellEnd"/>
-      <w:r>
-        <w:rPr>
-          <w:rFonts w:ascii="Arial" w:eastAsia="Times New Roman" w:hAnsi="Arial" w:cs="Arial"/>
-          <w:color w:val="000000"/>
-          <w:kern w:val="0"/>
-          <w:sz w:val="22"/>
-          <w:szCs w:val="22"/>
-          <w14:ligatures w14:val="none"/>
-        </w:rPr>
-        <w:t xml:space="preserve"> </w:t>
-      </w:r>
-      <w:proofErr w:type="spellStart"/>
-      <w:r>
-        <w:rPr>
-          <w:rFonts w:ascii="Arial" w:eastAsia="Times New Roman" w:hAnsi="Arial" w:cs="Arial"/>
-          <w:color w:val="000000"/>
-          <w:kern w:val="0"/>
-          <w:sz w:val="22"/>
-          <w:szCs w:val="22"/>
-          <w14:ligatures w14:val="none"/>
-        </w:rPr>
-        <w:t>havent</w:t>
-      </w:r>
-      <w:proofErr w:type="spellEnd"/>
-      <w:r>
-        <w:rPr>
-          <w:rFonts w:ascii="Arial" w:eastAsia="Times New Roman" w:hAnsi="Arial" w:cs="Arial"/>
-          <w:color w:val="000000"/>
-          <w:kern w:val="0"/>
-          <w:sz w:val="22"/>
-          <w:szCs w:val="22"/>
-          <w14:ligatures w14:val="none"/>
-        </w:rPr>
-        <w:t xml:space="preserve"> had any recent trips to those cafe who roast their own beans, then </w:t>
-      </w:r>
-      <w:proofErr w:type="spellStart"/>
-      <w:r>
-        <w:rPr>
-          <w:rFonts w:ascii="Arial" w:eastAsia="Times New Roman" w:hAnsi="Arial" w:cs="Arial"/>
-          <w:color w:val="000000"/>
-          <w:kern w:val="0"/>
-          <w:sz w:val="22"/>
-          <w:szCs w:val="22"/>
-          <w14:ligatures w14:val="none"/>
-        </w:rPr>
-        <w:t>i’d</w:t>
-      </w:r>
-      <w:proofErr w:type="spellEnd"/>
-      <w:r>
-        <w:rPr>
-          <w:rFonts w:ascii="Arial" w:eastAsia="Times New Roman" w:hAnsi="Arial" w:cs="Arial"/>
-          <w:color w:val="000000"/>
-          <w:kern w:val="0"/>
-          <w:sz w:val="22"/>
-          <w:szCs w:val="22"/>
-          <w14:ligatures w14:val="none"/>
-        </w:rPr>
-        <w:t xml:space="preserve"> either have to go to Shopee, or those individual website right. Shopee has everything you want or need, but it can get a little bit difficult when you want to narrow down on the coffee profiles right. Independent website, obviously, you only know when you know them. It doesn’t just pop out  magically. But, with this The Beans Hub, look, </w:t>
-      </w:r>
-      <w:proofErr w:type="spellStart"/>
-      <w:r>
-        <w:rPr>
-          <w:rFonts w:ascii="Arial" w:eastAsia="Times New Roman" w:hAnsi="Arial" w:cs="Arial"/>
-          <w:color w:val="000000"/>
-          <w:kern w:val="0"/>
-          <w:sz w:val="22"/>
-          <w:szCs w:val="22"/>
-          <w14:ligatures w14:val="none"/>
-        </w:rPr>
-        <w:t>i</w:t>
-      </w:r>
-      <w:proofErr w:type="spellEnd"/>
+        <w:t>And for those i</w:t>
+      </w:r>
+      <w:r>
+        <w:rPr>
+          <w:rFonts w:ascii="Arial" w:eastAsia="Times New Roman" w:hAnsi="Arial" w:cs="Arial"/>
+          <w:color w:val="000000"/>
+          <w:kern w:val="0"/>
+          <w:sz w:val="22"/>
+          <w:szCs w:val="22"/>
+          <w14:ligatures w14:val="none"/>
+        </w:rPr>
+        <w:t xml:space="preserve">ndependent website, obviously, you only know when you know them. It doesn’t just pop out  magically. </w:t>
+      </w:r>
+      <w:r>
+        <w:rPr>
+          <w:rFonts w:ascii="Arial" w:eastAsia="Times New Roman" w:hAnsi="Arial" w:cs="Arial"/>
+          <w:color w:val="000000"/>
+          <w:kern w:val="0"/>
+          <w:sz w:val="22"/>
+          <w:szCs w:val="22"/>
+          <w14:ligatures w14:val="none"/>
+        </w:rPr>
+        <w:br/>
+      </w:r>
+      <w:r>
+        <w:rPr>
+          <w:rFonts w:ascii="Arial" w:eastAsia="Times New Roman" w:hAnsi="Arial" w:cs="Arial"/>
+          <w:color w:val="000000"/>
+          <w:kern w:val="0"/>
+          <w:sz w:val="22"/>
+          <w:szCs w:val="22"/>
+          <w14:ligatures w14:val="none"/>
+        </w:rPr>
+        <w:t xml:space="preserve">But, with this The Beans Hub, look, </w:t>
+      </w:r>
+      <w:r>
+        <w:rPr>
+          <w:rFonts w:ascii="Arial" w:eastAsia="Times New Roman" w:hAnsi="Arial" w:cs="Arial"/>
+          <w:color w:val="000000"/>
+          <w:kern w:val="0"/>
+          <w:sz w:val="22"/>
+          <w:szCs w:val="22"/>
+          <w14:ligatures w14:val="none"/>
+        </w:rPr>
+        <w:t>I</w:t>
+      </w:r>
       <w:r>
         <w:rPr>
           <w:rFonts w:ascii="Arial" w:eastAsia="Times New Roman" w:hAnsi="Arial" w:cs="Arial"/>
@@ -565,16 +698,18 @@
         </w:rPr>
         <w:t xml:space="preserve"> can find all the beans I want.</w:t>
       </w:r>
-    </w:p>
-    <w:p>
-      <w:pPr>
-        <w:spacing w:after="0" w:line="240" w:lineRule="auto"/>
-        <w:rPr>
-          <w:rFonts w:ascii="Times New Roman" w:eastAsia="Times New Roman" w:hAnsi="Times New Roman" w:cs="Times New Roman"/>
-          <w:kern w:val="0"/>
-          <w14:ligatures w14:val="none"/>
-        </w:rPr>
-      </w:pPr>
+      <w:r>
+        <w:rPr>
+          <w:rFonts w:ascii="Arial" w:eastAsia="Times New Roman" w:hAnsi="Arial" w:cs="Arial"/>
+          <w:color w:val="000000"/>
+          <w:kern w:val="0"/>
+          <w:sz w:val="22"/>
+          <w:szCs w:val="22"/>
+          <w14:ligatures w14:val="none"/>
+        </w:rPr>
+        <w:br/>
+        <w:t>Sounds cool right</w:t>
+      </w:r>
     </w:p>
     <w:p>
       <w:pPr>
@@ -653,19 +788,17 @@
         </w:rPr>
         <w:t xml:space="preserve">This is my day 3 of building The Beans Hub publicly. I applied to join TikTok as a data scientist but they </w:t>
       </w:r>
-      <w:proofErr w:type="spellStart"/>
-      <w:r>
-        <w:rPr>
-          <w:rFonts w:ascii="Arial" w:eastAsia="Times New Roman" w:hAnsi="Arial" w:cs="Arial"/>
-          <w:color w:val="000000"/>
-          <w:kern w:val="0"/>
-          <w:sz w:val="22"/>
-          <w:szCs w:val="22"/>
-          <w14:ligatures w14:val="none"/>
-        </w:rPr>
-        <w:t>didnt</w:t>
-      </w:r>
-      <w:proofErr w:type="spellEnd"/>
+      <w:r>
+        <w:rPr>
+          <w:rFonts w:ascii="Arial" w:eastAsia="Times New Roman" w:hAnsi="Arial" w:cs="Arial"/>
+          <w:color w:val="000000"/>
+          <w:kern w:val="0"/>
+          <w:sz w:val="22"/>
+          <w:szCs w:val="22"/>
+          <w14:ligatures w14:val="none"/>
+        </w:rPr>
+        <w:t>didn’t</w:t>
+      </w:r>
       <w:r>
         <w:rPr>
           <w:rFonts w:ascii="Arial" w:eastAsia="Times New Roman" w:hAnsi="Arial" w:cs="Arial"/>
@@ -677,19 +810,17 @@
         </w:rPr>
         <w:t xml:space="preserve"> want me! And recently everyone is talking about personal branding. But </w:t>
       </w:r>
-      <w:proofErr w:type="spellStart"/>
-      <w:r>
-        <w:rPr>
-          <w:rFonts w:ascii="Arial" w:eastAsia="Times New Roman" w:hAnsi="Arial" w:cs="Arial"/>
-          <w:color w:val="000000"/>
-          <w:kern w:val="0"/>
-          <w:sz w:val="22"/>
-          <w:szCs w:val="22"/>
-          <w14:ligatures w14:val="none"/>
-        </w:rPr>
-        <w:t>i</w:t>
-      </w:r>
-      <w:proofErr w:type="spellEnd"/>
+      <w:r>
+        <w:rPr>
+          <w:rFonts w:ascii="Arial" w:eastAsia="Times New Roman" w:hAnsi="Arial" w:cs="Arial"/>
+          <w:color w:val="000000"/>
+          <w:kern w:val="0"/>
+          <w:sz w:val="22"/>
+          <w:szCs w:val="22"/>
+          <w14:ligatures w14:val="none"/>
+        </w:rPr>
+        <w:t>I</w:t>
+      </w:r>
       <w:r>
         <w:rPr>
           <w:rFonts w:ascii="Arial" w:eastAsia="Times New Roman" w:hAnsi="Arial" w:cs="Arial"/>
@@ -701,77 +832,93 @@
         </w:rPr>
         <w:t xml:space="preserve"> have so much fear around it. I used to want to be a creator or something you know, getting those brands merchants sounds so nice especially when you were just starting out working. But when </w:t>
       </w:r>
-      <w:proofErr w:type="spellStart"/>
-      <w:r>
-        <w:rPr>
-          <w:rFonts w:ascii="Arial" w:eastAsia="Times New Roman" w:hAnsi="Arial" w:cs="Arial"/>
-          <w:color w:val="000000"/>
-          <w:kern w:val="0"/>
-          <w:sz w:val="22"/>
-          <w:szCs w:val="22"/>
-          <w14:ligatures w14:val="none"/>
-        </w:rPr>
-        <w:t>i</w:t>
-      </w:r>
-      <w:proofErr w:type="spellEnd"/>
-      <w:r>
-        <w:rPr>
-          <w:rFonts w:ascii="Arial" w:eastAsia="Times New Roman" w:hAnsi="Arial" w:cs="Arial"/>
-          <w:color w:val="000000"/>
-          <w:kern w:val="0"/>
-          <w:sz w:val="22"/>
-          <w:szCs w:val="22"/>
-          <w14:ligatures w14:val="none"/>
-        </w:rPr>
-        <w:t xml:space="preserve"> actually think about it, </w:t>
-      </w:r>
-      <w:proofErr w:type="spellStart"/>
-      <w:r>
-        <w:rPr>
-          <w:rFonts w:ascii="Arial" w:eastAsia="Times New Roman" w:hAnsi="Arial" w:cs="Arial"/>
-          <w:color w:val="000000"/>
-          <w:kern w:val="0"/>
-          <w:sz w:val="22"/>
-          <w:szCs w:val="22"/>
-          <w14:ligatures w14:val="none"/>
-        </w:rPr>
-        <w:t>i’m</w:t>
-      </w:r>
-      <w:proofErr w:type="spellEnd"/>
-      <w:r>
-        <w:rPr>
-          <w:rFonts w:ascii="Arial" w:eastAsia="Times New Roman" w:hAnsi="Arial" w:cs="Arial"/>
-          <w:color w:val="000000"/>
-          <w:kern w:val="0"/>
-          <w:sz w:val="22"/>
-          <w:szCs w:val="22"/>
-          <w14:ligatures w14:val="none"/>
-        </w:rPr>
-        <w:t xml:space="preserve"> scared actually. Sometimes </w:t>
-      </w:r>
-      <w:proofErr w:type="spellStart"/>
-      <w:r>
-        <w:rPr>
-          <w:rFonts w:ascii="Arial" w:eastAsia="Times New Roman" w:hAnsi="Arial" w:cs="Arial"/>
-          <w:color w:val="000000"/>
-          <w:kern w:val="0"/>
-          <w:sz w:val="22"/>
-          <w:szCs w:val="22"/>
-          <w14:ligatures w14:val="none"/>
-        </w:rPr>
-        <w:t>i</w:t>
-      </w:r>
-      <w:proofErr w:type="spellEnd"/>
-      <w:r>
-        <w:rPr>
-          <w:rFonts w:ascii="Arial" w:eastAsia="Times New Roman" w:hAnsi="Arial" w:cs="Arial"/>
-          <w:color w:val="000000"/>
-          <w:kern w:val="0"/>
-          <w:sz w:val="22"/>
-          <w:szCs w:val="22"/>
-          <w14:ligatures w14:val="none"/>
-        </w:rPr>
-        <w:t xml:space="preserve"> tell myself, it’s exposure therapy. It’s the fastest way to kill the fear in my head. I’m going to let everybody knows my coffee beans project and let TikTok change my life. People say, you have to believe something crazy about yourself before anyone else does.</w:t>
+      <w:r>
+        <w:rPr>
+          <w:rFonts w:ascii="Arial" w:eastAsia="Times New Roman" w:hAnsi="Arial" w:cs="Arial"/>
+          <w:color w:val="000000"/>
+          <w:kern w:val="0"/>
+          <w:sz w:val="22"/>
+          <w:szCs w:val="22"/>
+          <w14:ligatures w14:val="none"/>
+        </w:rPr>
+        <w:t xml:space="preserve">I </w:t>
+      </w:r>
+      <w:r>
+        <w:rPr>
+          <w:rFonts w:ascii="Arial" w:eastAsia="Times New Roman" w:hAnsi="Arial" w:cs="Arial"/>
+          <w:color w:val="000000"/>
+          <w:kern w:val="0"/>
+          <w:sz w:val="22"/>
+          <w:szCs w:val="22"/>
+          <w14:ligatures w14:val="none"/>
+        </w:rPr>
+        <w:t xml:space="preserve">actually think about it, </w:t>
+      </w:r>
+      <w:r>
+        <w:rPr>
+          <w:rFonts w:ascii="Arial" w:eastAsia="Times New Roman" w:hAnsi="Arial" w:cs="Arial"/>
+          <w:color w:val="000000"/>
+          <w:kern w:val="0"/>
+          <w:sz w:val="22"/>
+          <w:szCs w:val="22"/>
+          <w14:ligatures w14:val="none"/>
+        </w:rPr>
+        <w:t>I</w:t>
+      </w:r>
+      <w:r>
+        <w:rPr>
+          <w:rFonts w:ascii="Arial" w:eastAsia="Times New Roman" w:hAnsi="Arial" w:cs="Arial"/>
+          <w:color w:val="000000"/>
+          <w:kern w:val="0"/>
+          <w:sz w:val="22"/>
+          <w:szCs w:val="22"/>
+          <w14:ligatures w14:val="none"/>
+        </w:rPr>
+        <w:t xml:space="preserve">’m scared actually. Sometimes </w:t>
+      </w:r>
+      <w:r>
+        <w:rPr>
+          <w:rFonts w:ascii="Arial" w:eastAsia="Times New Roman" w:hAnsi="Arial" w:cs="Arial"/>
+          <w:color w:val="000000"/>
+          <w:kern w:val="0"/>
+          <w:sz w:val="22"/>
+          <w:szCs w:val="22"/>
+          <w14:ligatures w14:val="none"/>
+        </w:rPr>
+        <w:t>I</w:t>
+      </w:r>
+      <w:r>
+        <w:rPr>
+          <w:rFonts w:ascii="Arial" w:eastAsia="Times New Roman" w:hAnsi="Arial" w:cs="Arial"/>
+          <w:color w:val="000000"/>
+          <w:kern w:val="0"/>
+          <w:sz w:val="22"/>
+          <w:szCs w:val="22"/>
+          <w14:ligatures w14:val="none"/>
+        </w:rPr>
+        <w:t xml:space="preserve"> tell myself, it’s exposure therapy. It’s the fastest way to kill the fear in my head. I’m going to let everybody knows my coffee beans project and let </w:t>
+      </w:r>
+      <w:r>
+        <w:rPr>
+          <w:rFonts w:ascii="Arial" w:eastAsia="Times New Roman" w:hAnsi="Arial" w:cs="Arial"/>
+          <w:color w:val="000000"/>
+          <w:kern w:val="0"/>
+          <w:sz w:val="22"/>
+          <w:szCs w:val="22"/>
+          <w14:ligatures w14:val="none"/>
+        </w:rPr>
+        <w:t>social media</w:t>
+      </w:r>
+      <w:r>
+        <w:rPr>
+          <w:rFonts w:ascii="Arial" w:eastAsia="Times New Roman" w:hAnsi="Arial" w:cs="Arial"/>
+          <w:color w:val="000000"/>
+          <w:kern w:val="0"/>
+          <w:sz w:val="22"/>
+          <w:szCs w:val="22"/>
+          <w14:ligatures w14:val="none"/>
+        </w:rPr>
+        <w:t xml:space="preserve"> change my life. People say, you have to believe something crazy about yourself before anyone else does.</w:t>
       </w:r>
     </w:p>
     <w:p>
@@ -817,6 +964,17 @@
           <w14:ligatures w14:val="none"/>
         </w:rPr>
         <w:t>. </w:t>
+      </w:r>
+      <w:r>
+        <w:rPr>
+          <w:rFonts w:ascii="Arial" w:eastAsia="Times New Roman" w:hAnsi="Arial" w:cs="Arial"/>
+          <w:color w:val="000000"/>
+          <w:kern w:val="0"/>
+          <w:sz w:val="22"/>
+          <w:szCs w:val="22"/>
+          <w14:ligatures w14:val="none"/>
+        </w:rPr>
+        <w:t>See if The Beans Hub can get 10k followers first, or TikTok wants me first!</w:t>
       </w:r>
     </w:p>
     <w:p>
@@ -853,242 +1011,215 @@
           <w14:ligatures w14:val="none"/>
         </w:rPr>
         <w:lastRenderedPageBreak/>
-        <w:t>Episode 3: TikTok doesn’t want me</w:t>
+        <w:t xml:space="preserve">Episode </w:t>
+      </w:r>
+      <w:r>
+        <w:rPr>
+          <w:rFonts w:ascii="Arial" w:eastAsia="Times New Roman" w:hAnsi="Arial" w:cs="Arial"/>
+          <w:color w:val="000000"/>
+          <w:kern w:val="0"/>
+          <w:sz w:val="32"/>
+          <w:szCs w:val="32"/>
+          <w14:ligatures w14:val="none"/>
+        </w:rPr>
+        <w:t>4</w:t>
+      </w:r>
+      <w:r>
+        <w:rPr>
+          <w:rFonts w:ascii="Arial" w:eastAsia="Times New Roman" w:hAnsi="Arial" w:cs="Arial"/>
+          <w:color w:val="000000"/>
+          <w:kern w:val="0"/>
+          <w:sz w:val="32"/>
+          <w:szCs w:val="32"/>
+          <w14:ligatures w14:val="none"/>
+        </w:rPr>
+        <w:t>: TikTok doesn’t want me</w:t>
       </w:r>
     </w:p>
     <w:p>
       <w:pPr>
-        <w:spacing w:after="0" w:line="240" w:lineRule="auto"/>
-        <w:rPr>
-          <w:rFonts w:ascii="Times New Roman" w:eastAsia="Times New Roman" w:hAnsi="Times New Roman" w:cs="Times New Roman"/>
-          <w:kern w:val="0"/>
-          <w14:ligatures w14:val="none"/>
+        <w:rPr>
+          <w:rFonts w:ascii="Arial" w:hAnsi="Arial" w:cs="Arial"/>
+          <w:sz w:val="22"/>
+          <w:szCs w:val="22"/>
         </w:rPr>
       </w:pPr>
     </w:p>
     <w:p>
       <w:pPr>
-        <w:spacing w:after="0" w:line="240" w:lineRule="auto"/>
-        <w:rPr>
-          <w:rFonts w:ascii="Times New Roman" w:eastAsia="Times New Roman" w:hAnsi="Times New Roman" w:cs="Times New Roman"/>
-          <w:kern w:val="0"/>
-          <w14:ligatures w14:val="none"/>
+        <w:rPr>
+          <w:rFonts w:ascii="Arial" w:hAnsi="Arial" w:cs="Arial"/>
+          <w:sz w:val="22"/>
+          <w:szCs w:val="22"/>
         </w:rPr>
       </w:pPr>
       <w:r>
         <w:rPr>
-          <w:rFonts w:ascii="Arial" w:eastAsia="Times New Roman" w:hAnsi="Arial" w:cs="Arial"/>
-          <w:color w:val="000000"/>
-          <w:kern w:val="0"/>
-          <w:sz w:val="22"/>
-          <w:szCs w:val="22"/>
-          <w14:ligatures w14:val="none"/>
+          <w:rFonts w:ascii="Arial" w:hAnsi="Arial" w:cs="Arial"/>
+          <w:sz w:val="22"/>
+          <w:szCs w:val="22"/>
         </w:rPr>
         <w:t>AI is replacing my job as a data scientist. So I quit and built a coffee website instead.</w:t>
       </w:r>
     </w:p>
     <w:p>
       <w:pPr>
-        <w:spacing w:after="0" w:line="240" w:lineRule="auto"/>
-        <w:rPr>
-          <w:rFonts w:ascii="Times New Roman" w:eastAsia="Times New Roman" w:hAnsi="Times New Roman" w:cs="Times New Roman"/>
-          <w:kern w:val="0"/>
-          <w14:ligatures w14:val="none"/>
+        <w:rPr>
+          <w:rFonts w:ascii="Arial" w:hAnsi="Arial" w:cs="Arial"/>
+          <w:sz w:val="22"/>
+          <w:szCs w:val="22"/>
         </w:rPr>
       </w:pPr>
       <w:r>
         <w:rPr>
-          <w:rFonts w:ascii="Arial" w:eastAsia="Times New Roman" w:hAnsi="Arial" w:cs="Arial"/>
-          <w:color w:val="000000"/>
-          <w:kern w:val="0"/>
-          <w:sz w:val="22"/>
-          <w:szCs w:val="22"/>
-          <w14:ligatures w14:val="none"/>
-        </w:rPr>
-        <w:t>This is my day 3 of building The Beans Hub publicly.</w:t>
+          <w:rFonts w:ascii="Arial" w:hAnsi="Arial" w:cs="Arial"/>
+          <w:sz w:val="22"/>
+          <w:szCs w:val="22"/>
+        </w:rPr>
+        <w:t xml:space="preserve">This is my day </w:t>
+      </w:r>
+      <w:r>
+        <w:rPr>
+          <w:rFonts w:ascii="Arial" w:hAnsi="Arial" w:cs="Arial"/>
+          <w:sz w:val="22"/>
+          <w:szCs w:val="22"/>
+        </w:rPr>
+        <w:t>4</w:t>
+      </w:r>
+      <w:r>
+        <w:rPr>
+          <w:rFonts w:ascii="Arial" w:hAnsi="Arial" w:cs="Arial"/>
+          <w:sz w:val="22"/>
+          <w:szCs w:val="22"/>
+        </w:rPr>
+        <w:t xml:space="preserve"> of building The Beans Hub publicly.</w:t>
       </w:r>
     </w:p>
     <w:p>
       <w:pPr>
-        <w:spacing w:after="0" w:line="240" w:lineRule="auto"/>
-        <w:rPr>
-          <w:rFonts w:ascii="Times New Roman" w:eastAsia="Times New Roman" w:hAnsi="Times New Roman" w:cs="Times New Roman"/>
-          <w:kern w:val="0"/>
-          <w14:ligatures w14:val="none"/>
+        <w:rPr>
+          <w:rFonts w:ascii="Arial" w:hAnsi="Arial" w:cs="Arial"/>
+          <w:sz w:val="22"/>
+          <w:szCs w:val="22"/>
         </w:rPr>
       </w:pPr>
+      <w:r>
+        <w:rPr>
+          <w:rFonts w:ascii="Arial" w:hAnsi="Arial" w:cs="Arial"/>
+          <w:sz w:val="22"/>
+          <w:szCs w:val="22"/>
+        </w:rPr>
+        <w:t>Just 3 years ago, everyone wants to be a data scientist. It has that bright future that everyone wants to be in. Universities started offering data science courses. But, now,</w:t>
+      </w:r>
+      <w:r>
+        <w:rPr>
+          <w:rFonts w:ascii="Arial" w:hAnsi="Arial" w:cs="Arial"/>
+          <w:sz w:val="22"/>
+          <w:szCs w:val="22"/>
+        </w:rPr>
+        <w:t xml:space="preserve"> a lot of data scientists are getting laid off because there’s a cheaper employee now, aka AI.</w:t>
+      </w:r>
     </w:p>
     <w:p>
       <w:pPr>
-        <w:spacing w:after="0" w:line="240" w:lineRule="auto"/>
-        <w:rPr>
-          <w:rFonts w:ascii="Times New Roman" w:eastAsia="Times New Roman" w:hAnsi="Times New Roman" w:cs="Times New Roman"/>
-          <w:kern w:val="0"/>
-          <w14:ligatures w14:val="none"/>
+        <w:rPr>
+          <w:rFonts w:ascii="Arial" w:hAnsi="Arial" w:cs="Arial"/>
+          <w:sz w:val="22"/>
+          <w:szCs w:val="22"/>
         </w:rPr>
       </w:pPr>
       <w:r>
         <w:rPr>
-          <w:rFonts w:ascii="Arial" w:eastAsia="Times New Roman" w:hAnsi="Arial" w:cs="Arial"/>
-          <w:color w:val="000000"/>
-          <w:kern w:val="0"/>
-          <w:sz w:val="22"/>
-          <w:szCs w:val="22"/>
-          <w14:ligatures w14:val="none"/>
-        </w:rPr>
-        <w:t>You know what, I actually applied to TikTok as a data scientist. They didn't want me. So now I'm trying to get TikTok to want me in a completely different way, which honestly feels a bit scary when I say it out loud.</w:t>
+          <w:rFonts w:ascii="Arial" w:hAnsi="Arial" w:cs="Arial"/>
+          <w:sz w:val="22"/>
+          <w:szCs w:val="22"/>
+        </w:rPr>
+        <w:t xml:space="preserve">So I quit and turned my skills on coffee instead. </w:t>
       </w:r>
     </w:p>
     <w:p>
       <w:pPr>
-        <w:spacing w:after="0" w:line="240" w:lineRule="auto"/>
-        <w:rPr>
-          <w:rFonts w:ascii="Times New Roman" w:eastAsia="Times New Roman" w:hAnsi="Times New Roman" w:cs="Times New Roman"/>
-          <w:kern w:val="0"/>
-          <w14:ligatures w14:val="none"/>
+        <w:rPr>
+          <w:rFonts w:ascii="Arial" w:hAnsi="Arial" w:cs="Arial"/>
+          <w:sz w:val="22"/>
+          <w:szCs w:val="22"/>
         </w:rPr>
       </w:pPr>
       <w:r>
         <w:rPr>
-          <w:rFonts w:ascii="Arial" w:eastAsia="Times New Roman" w:hAnsi="Arial" w:cs="Arial"/>
-          <w:color w:val="000000"/>
-          <w:kern w:val="0"/>
-          <w:sz w:val="22"/>
-          <w:szCs w:val="22"/>
-          <w14:ligatures w14:val="none"/>
-        </w:rPr>
-        <w:t xml:space="preserve">Everyone's talking about personal branding right now and honestly, it scares me. I used to think getting brand deals as a creator sounded amazing, especially early in your career. But when I actually sit with it, I get scared. So I've been telling myself </w:t>
-      </w:r>
-      <w:proofErr w:type="spellStart"/>
-      <w:r>
-        <w:rPr>
-          <w:rFonts w:ascii="Arial" w:eastAsia="Times New Roman" w:hAnsi="Arial" w:cs="Arial"/>
-          <w:color w:val="000000"/>
-          <w:kern w:val="0"/>
-          <w:sz w:val="22"/>
-          <w:szCs w:val="22"/>
-          <w14:ligatures w14:val="none"/>
-        </w:rPr>
-        <w:t>it's</w:t>
-      </w:r>
-      <w:proofErr w:type="spellEnd"/>
-      <w:r>
-        <w:rPr>
-          <w:rFonts w:ascii="Arial" w:eastAsia="Times New Roman" w:hAnsi="Arial" w:cs="Arial"/>
-          <w:color w:val="000000"/>
-          <w:kern w:val="0"/>
-          <w:sz w:val="22"/>
-          <w:szCs w:val="22"/>
-          <w14:ligatures w14:val="none"/>
-        </w:rPr>
-        <w:t xml:space="preserve"> exposure therapy — the fastest way to kill the fear is to just do the thing while everyone's watching.</w:t>
+          <w:rFonts w:ascii="Arial" w:hAnsi="Arial" w:cs="Arial"/>
+          <w:sz w:val="22"/>
+          <w:szCs w:val="22"/>
+        </w:rPr>
+        <w:t>Here's the first thing that shocked me when I was collecting information about the specialty bean sold in Malaysia. Same size bag, 200 grams. The cheapest bean in my dataset: RM16, a Brazil Santos. The most expensive: RM740, a geisha beans from Panama region. That's like 46 times the price. For the same drink.</w:t>
       </w:r>
     </w:p>
     <w:p>
       <w:pPr>
-        <w:spacing w:after="0" w:line="240" w:lineRule="auto"/>
-        <w:rPr>
-          <w:rFonts w:ascii="Times New Roman" w:eastAsia="Times New Roman" w:hAnsi="Times New Roman" w:cs="Times New Roman"/>
-          <w:kern w:val="0"/>
-          <w14:ligatures w14:val="none"/>
+        <w:rPr>
+          <w:rFonts w:ascii="Arial" w:hAnsi="Arial" w:cs="Arial"/>
+          <w:sz w:val="22"/>
+          <w:szCs w:val="22"/>
         </w:rPr>
       </w:pPr>
+      <w:r>
+        <w:rPr>
+          <w:rFonts w:ascii="Arial" w:hAnsi="Arial" w:cs="Arial"/>
+          <w:sz w:val="22"/>
+          <w:szCs w:val="22"/>
+        </w:rPr>
+        <w:t xml:space="preserve">I don’t think you’ll be 46 times more awake, nor 46 times more productive by drinking. But will you be 46 times happier, that’s up to you to decide. </w:t>
+      </w:r>
     </w:p>
     <w:p>
       <w:pPr>
-        <w:spacing w:after="0" w:line="240" w:lineRule="auto"/>
-        <w:rPr>
-          <w:rFonts w:ascii="Times New Roman" w:eastAsia="Times New Roman" w:hAnsi="Times New Roman" w:cs="Times New Roman"/>
-          <w:kern w:val="0"/>
-          <w14:ligatures w14:val="none"/>
+        <w:rPr>
+          <w:rFonts w:ascii="Arial" w:hAnsi="Arial" w:cs="Arial"/>
+          <w:sz w:val="22"/>
+          <w:szCs w:val="22"/>
         </w:rPr>
       </w:pPr>
       <w:r>
         <w:rPr>
-          <w:rFonts w:ascii="Arial" w:eastAsia="Times New Roman" w:hAnsi="Arial" w:cs="Arial"/>
-          <w:color w:val="000000"/>
-          <w:kern w:val="0"/>
-          <w:sz w:val="22"/>
-          <w:szCs w:val="22"/>
-          <w14:ligatures w14:val="none"/>
-        </w:rPr>
-        <w:t>Today, we updated the roasters’ coffee beans. </w:t>
+          <w:rFonts w:ascii="Arial" w:hAnsi="Arial" w:cs="Arial"/>
+          <w:sz w:val="22"/>
+          <w:szCs w:val="22"/>
+        </w:rPr>
+        <w:t>The median is RM56. So if you're paying RM100+ for beans, you're already in the top quarter of the market. You can call yourself rich but my Asian mom will definitely not. So, if you like this, follow me. in the next episode I'll show you when that's actually worth it, and when you're just paying for a word on the bag.</w:t>
       </w:r>
     </w:p>
     <w:p>
       <w:pPr>
-        <w:spacing w:after="0" w:line="240" w:lineRule="auto"/>
-        <w:rPr>
-          <w:rFonts w:ascii="Times New Roman" w:eastAsia="Times New Roman" w:hAnsi="Times New Roman" w:cs="Times New Roman"/>
-          <w:kern w:val="0"/>
-          <w14:ligatures w14:val="none"/>
+        <w:rPr>
+          <w:rFonts w:ascii="Arial" w:hAnsi="Arial" w:cs="Arial"/>
+          <w:sz w:val="22"/>
+          <w:szCs w:val="22"/>
         </w:rPr>
       </w:pPr>
+      <w:r>
+        <w:rPr>
+          <w:rFonts w:ascii="Arial" w:hAnsi="Arial" w:cs="Arial"/>
+          <w:sz w:val="22"/>
+          <w:szCs w:val="22"/>
+        </w:rPr>
+        <w:t>Show the spreadsheet / scatter plot on screen. People love seeing the raw data scroll.</w:t>
+      </w:r>
     </w:p>
     <w:p>
       <w:pPr>
-        <w:spacing w:after="0" w:line="240" w:lineRule="auto"/>
-        <w:rPr>
-          <w:rFonts w:ascii="Times New Roman" w:eastAsia="Times New Roman" w:hAnsi="Times New Roman" w:cs="Times New Roman"/>
-          <w:kern w:val="0"/>
-          <w14:ligatures w14:val="none"/>
+        <w:rPr>
+          <w:rFonts w:ascii="Arial" w:hAnsi="Arial" w:cs="Arial"/>
+          <w:sz w:val="22"/>
+          <w:szCs w:val="22"/>
         </w:rPr>
       </w:pPr>
       <w:r>
         <w:rPr>
-          <w:rFonts w:ascii="Arial" w:eastAsia="Times New Roman" w:hAnsi="Arial" w:cs="Arial"/>
-          <w:color w:val="000000"/>
-          <w:kern w:val="0"/>
-          <w:sz w:val="22"/>
-          <w:szCs w:val="22"/>
-          <w14:ligatures w14:val="none"/>
-        </w:rPr>
-        <w:t>People say you have to believe something crazy about yourself before anyone else does.</w:t>
-      </w:r>
-    </w:p>
-    <w:p>
-      <w:pPr>
-        <w:spacing w:after="0" w:line="240" w:lineRule="auto"/>
-        <w:rPr>
-          <w:rFonts w:ascii="Times New Roman" w:eastAsia="Times New Roman" w:hAnsi="Times New Roman" w:cs="Times New Roman"/>
-          <w:kern w:val="0"/>
-          <w14:ligatures w14:val="none"/>
-        </w:rPr>
-      </w:pPr>
-      <w:r>
-        <w:rPr>
-          <w:rFonts w:ascii="Arial" w:eastAsia="Times New Roman" w:hAnsi="Arial" w:cs="Arial"/>
-          <w:color w:val="000000"/>
-          <w:kern w:val="0"/>
-          <w:sz w:val="22"/>
-          <w:szCs w:val="22"/>
-          <w14:ligatures w14:val="none"/>
-        </w:rPr>
-        <w:t xml:space="preserve">Trust the </w:t>
-      </w:r>
-      <w:proofErr w:type="spellStart"/>
-      <w:r>
-        <w:rPr>
-          <w:rFonts w:ascii="Arial" w:eastAsia="Times New Roman" w:hAnsi="Arial" w:cs="Arial"/>
-          <w:color w:val="000000"/>
-          <w:kern w:val="0"/>
-          <w:sz w:val="22"/>
-          <w:szCs w:val="22"/>
-          <w14:ligatures w14:val="none"/>
-        </w:rPr>
-        <w:t>delulu</w:t>
-      </w:r>
-      <w:proofErr w:type="spellEnd"/>
-      <w:r>
-        <w:rPr>
-          <w:rFonts w:ascii="Arial" w:eastAsia="Times New Roman" w:hAnsi="Arial" w:cs="Arial"/>
-          <w:color w:val="000000"/>
-          <w:kern w:val="0"/>
-          <w:sz w:val="22"/>
-          <w:szCs w:val="22"/>
-          <w14:ligatures w14:val="none"/>
-        </w:rPr>
-        <w:t>. See if The Beans Hub can get 10k followers first, or TikTok wants me first!</w:t>
+          <w:rFonts w:ascii="Arial" w:hAnsi="Arial" w:cs="Arial"/>
+          <w:sz w:val="22"/>
+          <w:szCs w:val="22"/>
+        </w:rPr>
+        <w:t>End card / CTA: This is episode 1 of my price series. Follow so you don't miss the one where I tell you which RM40 beans taste like RM100.</w:t>
       </w:r>
     </w:p>
     <w:p>
@@ -1214,36 +1345,21 @@
         <w:rPr>
           <w:b/>
         </w:rPr>
+        <w:lastRenderedPageBreak/>
         <w:t>Idea 1 — I analysed 850 coffee beans so you don't have to</w:t>
       </w:r>
     </w:p>
     <w:p>
-      <w:r>
-        <w:t>Hook (first 3 seconds): I'm a data scientist. AI is taking my job. So I turned my skills on coffee — and analysed every specialty bean sold in Malaysia. 850 of them.</w:t>
-      </w:r>
-    </w:p>
-    <w:p>
-      <w:r>
-        <w:t>Here's the first thing that shocked me. Same size bag, 200 grams. The cheapest bean in my dataset: RM16, a Brazil Santos. The most expensive: RM740, a Panama from The Roast Things. That's 46 times the price. For the same drink.</w:t>
-      </w:r>
-    </w:p>
-    <w:p>
-      <w:r>
-        <w:t>The median is RM56. So if you're paying RM100+ for beans, you're already in the top quarter of the market — and next episode I'll show you when that's actually worth it, and when you're just paying for a word on the bag.</w:t>
-      </w:r>
-    </w:p>
-    <w:p>
-      <w:r>
-        <w:lastRenderedPageBreak/>
-        <w:t>Show the spreadsheet / scatter plot on screen. People love seeing the raw data scroll.</w:t>
-      </w:r>
-    </w:p>
-    <w:p>
-      <w:r>
+      <w:pPr>
         <w:rPr>
           <w:i/>
         </w:rPr>
-        <w:t>End card / CTA: This is episode 1 of my price series. Follow so you don't miss the one where I tell you which RM40 beans taste like RM100.</w:t>
+      </w:pPr>
+      <w:r>
+        <w:rPr>
+          <w:i/>
+        </w:rPr>
+        <w:t>AI is replacing my job as a data scientist. So I quit and built a coffee website instead.</w:t>
       </w:r>
     </w:p>
     <w:p/>
@@ -1257,22 +1373,61 @@
     </w:p>
     <w:p>
       <w:r>
-        <w:t>Hook (first 3 seconds): I analysed 775 coffee bean prices and found a pattern your barista already knows but never told you.</w:t>
-      </w:r>
-    </w:p>
-    <w:p>
-      <w:r>
-        <w:t>Dark roast beans in Malaysia: median RM35.50. Medium: RM40. Light roast: RM80. The lighter the roast, the more you pay — light roasts cost more than DOUBLE dark roasts.</w:t>
-      </w:r>
-    </w:p>
-    <w:p>
-      <w:r>
-        <w:t>Why? Roasters put their best, cleanest beans into light roasts, because a light roast hides nothing. Every defect shows. Dark roasting can mask lower-grade beans — the roasty flavour covers everything.</w:t>
-      </w:r>
-    </w:p>
-    <w:p>
-      <w:r>
-        <w:t>So here's the money tip: if you drink milk coffee — lattes, white coffee — you don't need an RM80 light roast. The milk will bury those delicate notes anyway. A good RM35-40 medium-dark will taste better in milk. Save the light roasts for black coffee.</w:t>
+        <w:t xml:space="preserve">Hook (first 3 seconds): I analysed </w:t>
+      </w:r>
+      <w:r>
+        <w:t>800+ bags of</w:t>
+      </w:r>
+      <w:r>
+        <w:t xml:space="preserve"> coffee bean prices and found a pattern your barista already knows but never told you.</w:t>
+      </w:r>
+    </w:p>
+    <w:p>
+      <w:r>
+        <w:t xml:space="preserve">Dark roast beans in Malaysia: median RM35.50. Medium: RM40. Light roast: RM80. </w:t>
+      </w:r>
+      <w:r>
+        <w:t xml:space="preserve">That’s double you know. </w:t>
+      </w:r>
+      <w:r>
+        <w:t>The lighter the roast, the more you pay</w:t>
+      </w:r>
+      <w:r>
+        <w:t>. But, the café can save electricity from roasting right? What stupid question is this!</w:t>
+      </w:r>
+    </w:p>
+    <w:p>
+      <w:r>
+        <w:t>Roasters put their best, cleanest beans into light roasts, because a light roast hides nothing. Every defect</w:t>
+      </w:r>
+      <w:r>
+        <w:t xml:space="preserve"> in the beans</w:t>
+      </w:r>
+      <w:r>
+        <w:t xml:space="preserve"> shows</w:t>
+      </w:r>
+      <w:r>
+        <w:t xml:space="preserve"> up</w:t>
+      </w:r>
+      <w:r>
+        <w:t xml:space="preserve">. Dark roasting can mask lower-grade beans </w:t>
+      </w:r>
+      <w:r>
+        <w:t>because</w:t>
+      </w:r>
+      <w:r>
+        <w:t xml:space="preserve"> the roasty flavour covers everything.</w:t>
+      </w:r>
+    </w:p>
+    <w:p>
+      <w:r>
+        <w:t xml:space="preserve">So </w:t>
+      </w:r>
+      <w:r>
+        <w:t>here’s some financial advice,</w:t>
+      </w:r>
+      <w:r>
+        <w:t xml:space="preserve"> if you drink milk coffee — lattes, white coffee — you don't need an RM80 light roast. The milk will bury those delicate notes anyway. A good RM35-40 medium-dark will taste better in milk. Save the light roasts for black coffee.</w:t>
       </w:r>
     </w:p>
     <w:p>

</xml_diff>